<commit_message>
adasd Please enter the commit message for your changes. Lines starting
</commit_message>
<xml_diff>
--- a/USN App2000 Pasient Journal (1).docx
+++ b/USN App2000 Pasient Journal (1).docx
@@ -4437,10 +4437,51 @@
         <w:pStyle w:val="Heading3"/>
       </w:pPr>
       <w:bookmarkStart w:id="23" w:name="_Toc242708875"/>
+      <w:proofErr w:type="spellStart"/>
       <w:r>
         <w:t>Github</w:t>
       </w:r>
       <w:bookmarkEnd w:id="23"/>
+      <w:proofErr w:type="spellEnd"/>
+    </w:p>
+    <w:p>
+      <w:r>
+        <w:drawing>
+          <wp:inline distT="0" distB="0" distL="0" distR="0" wp14:anchorId="05E77426" wp14:editId="1DA12CAA">
+            <wp:extent cx="5759450" cy="3185795"/>
+            <wp:effectExtent l="0" t="0" r="0" b="0"/>
+            <wp:docPr id="1080619887" name="Picture 1" descr="The image is a GitHub repository dashboard displaying the statistics for a project named 'APP2000-Helseoppgave'.&#10;&#10;AI-generated content may be incorrect."/>
+            <wp:cNvGraphicFramePr>
+              <a:graphicFrameLocks xmlns:a="http://schemas.openxmlformats.org/drawingml/2006/main" noChangeAspect="1"/>
+            </wp:cNvGraphicFramePr>
+            <a:graphic xmlns:a="http://schemas.openxmlformats.org/drawingml/2006/main">
+              <a:graphicData uri="http://schemas.openxmlformats.org/drawingml/2006/picture">
+                <pic:pic xmlns:pic="http://schemas.openxmlformats.org/drawingml/2006/picture">
+                  <pic:nvPicPr>
+                    <pic:cNvPr id="1080619887" name="Picture 1" descr="The image is a GitHub repository dashboard displaying the statistics for a project named 'APP2000-Helseoppgave'.&#10;&#10;AI-generated content may be incorrect."/>
+                    <pic:cNvPicPr/>
+                  </pic:nvPicPr>
+                  <pic:blipFill>
+                    <a:blip r:embed="rId16"/>
+                    <a:stretch>
+                      <a:fillRect/>
+                    </a:stretch>
+                  </pic:blipFill>
+                  <pic:spPr>
+                    <a:xfrm>
+                      <a:off x="0" y="0"/>
+                      <a:ext cx="5759450" cy="3185795"/>
+                    </a:xfrm>
+                    <a:prstGeom prst="rect">
+                      <a:avLst/>
+                    </a:prstGeom>
+                  </pic:spPr>
+                </pic:pic>
+              </a:graphicData>
+            </a:graphic>
+          </wp:inline>
+        </w:drawing>
+      </w:r>
     </w:p>
     <w:p/>
     <w:p/>
@@ -4458,7 +4499,6 @@
       </w:pPr>
       <w:bookmarkStart w:id="24" w:name="_Toc242708876"/>
       <w:r>
-        <w:lastRenderedPageBreak/>
         <w:t>Kildehenvisninger, sitering og litteraturliste</w:t>
       </w:r>
       <w:bookmarkEnd w:id="24"/>
@@ -4494,7 +4534,7 @@
       <w:r>
         <w:t xml:space="preserve">Det finnes mange formelle systemer for å skrive en korrekt litteraturliste. Et av de mest brukte systemene er APA. Kildekompasset har en utmerket eksempelsamling i APA, se </w:t>
       </w:r>
-      <w:hyperlink r:id="rId16" w:history="1">
+      <w:hyperlink r:id="rId17" w:history="1">
         <w:r>
           <w:rPr>
             <w:rStyle w:val="Hyperlink"/>
@@ -4540,7 +4580,7 @@
       <w:r>
         <w:t xml:space="preserve">Se mer informasjon om USN sine retningslinjer for bruk av KI her: </w:t>
       </w:r>
-      <w:hyperlink r:id="rId17" w:history="1">
+      <w:hyperlink r:id="rId18" w:history="1">
         <w:r>
           <w:rPr>
             <w:rStyle w:val="Hyperlink"/>
@@ -4630,7 +4670,7 @@
         </w:rPr>
         <w:t xml:space="preserve"> første skritt er å orientere seg på heimesida til Etiske forskingskomitéer: </w:t>
       </w:r>
-      <w:hyperlink r:id="rId18" w:history="1">
+      <w:hyperlink r:id="rId19" w:history="1">
         <w:r>
           <w:rPr>
             <w:rStyle w:val="Hyperlink"/>
@@ -4871,7 +4911,7 @@
       <w:r>
         <w:t>(23. mars versjon) [Stor språkmodell]. </w:t>
       </w:r>
-      <w:hyperlink r:id="rId19" w:tgtFrame="_blank" w:tooltip="https://chat.openai.com/" w:history="1">
+      <w:hyperlink r:id="rId20" w:tgtFrame="_blank" w:tooltip="https://chat.openai.com/" w:history="1">
         <w:r>
           <w:rPr>
             <w:rStyle w:val="Hyperlink"/>
@@ -4898,12 +4938,12 @@
     </w:p>
     <w:p/>
     <w:sectPr>
-      <w:headerReference w:type="even" r:id="rId20"/>
-      <w:headerReference w:type="default" r:id="rId21"/>
-      <w:footerReference w:type="even" r:id="rId22"/>
-      <w:footerReference w:type="default" r:id="rId23"/>
-      <w:headerReference w:type="first" r:id="rId24"/>
-      <w:footerReference w:type="first" r:id="rId25"/>
+      <w:headerReference w:type="even" r:id="rId21"/>
+      <w:headerReference w:type="default" r:id="rId22"/>
+      <w:footerReference w:type="even" r:id="rId23"/>
+      <w:footerReference w:type="default" r:id="rId24"/>
+      <w:headerReference w:type="first" r:id="rId25"/>
+      <w:footerReference w:type="first" r:id="rId26"/>
       <w:pgSz w:w="11906" w:h="16838"/>
       <w:pgMar w:top="1270" w:right="1418" w:bottom="1985" w:left="1418" w:header="709" w:footer="567" w:gutter="0"/>
       <w:cols w:space="708"/>
@@ -5011,7 +5051,7 @@
         </mc:Choice>
         <mc:Fallback>
           <w:pict>
-            <v:line w14:anchorId="6E2743F3" id="Rett linje 2" o:spid="_x0000_s1026" alt="&quot;&quot;" style="position:absolute;z-index:251658243;visibility:visible;mso-wrap-style:square;mso-width-percent:0;mso-wrap-distance-left:9pt;mso-wrap-distance-top:0;mso-wrap-distance-right:9pt;mso-wrap-distance-bottom:0;mso-position-horizontal:absolute;mso-position-horizontal-relative:page;mso-position-vertical:absolute;mso-position-vertical-relative:page;mso-width-percent:0;mso-width-relative:margin" from="70.8pt,791.2pt" to="524.4pt,791.2pt" o:gfxdata="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" strokecolor="black [3213]" strokeweight=".5pt">
+            <v:line w14:anchorId="770C4603" id="Rett linje 2" o:spid="_x0000_s1026" alt="&quot;&quot;" style="position:absolute;z-index:251658243;visibility:visible;mso-wrap-style:square;mso-width-percent:0;mso-wrap-distance-left:9pt;mso-wrap-distance-top:0;mso-wrap-distance-right:9pt;mso-wrap-distance-bottom:0;mso-position-horizontal:absolute;mso-position-horizontal-relative:page;mso-position-vertical:absolute;mso-position-vertical-relative:page;mso-width-percent:0;mso-width-relative:margin" from="70.8pt,791.2pt" to="524.4pt,791.2pt" o:gfxdata="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" strokecolor="black [3213]" strokeweight=".5pt">
               <v:stroke joinstyle="miter"/>
               <w10:wrap anchorx="page" anchory="page"/>
             </v:line>
@@ -5155,7 +5195,7 @@
         </mc:Choice>
         <mc:Fallback>
           <w:pict>
-            <v:line w14:anchorId="1A904140" id="Rett linje 23" o:spid="_x0000_s1026" alt="&quot;&quot;" style="position:absolute;z-index:251658241;visibility:visible;mso-wrap-style:square;mso-width-percent:0;mso-wrap-distance-left:9pt;mso-wrap-distance-top:0;mso-wrap-distance-right:9pt;mso-wrap-distance-bottom:0;mso-position-horizontal:absolute;mso-position-horizontal-relative:page;mso-position-vertical:absolute;mso-position-vertical-relative:page;mso-width-percent:0;mso-width-relative:margin" from="70.8pt,791.2pt" to="524.4pt,791.2pt" o:gfxdata="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" strokecolor="black [3213]" strokeweight=".5pt">
+            <v:line w14:anchorId="4AB77567" id="Rett linje 23" o:spid="_x0000_s1026" alt="&quot;&quot;" style="position:absolute;z-index:251658241;visibility:visible;mso-wrap-style:square;mso-width-percent:0;mso-wrap-distance-left:9pt;mso-wrap-distance-top:0;mso-wrap-distance-right:9pt;mso-wrap-distance-bottom:0;mso-position-horizontal:absolute;mso-position-horizontal-relative:page;mso-position-vertical:absolute;mso-position-vertical-relative:page;mso-width-percent:0;mso-width-relative:margin" from="70.8pt,791.2pt" to="524.4pt,791.2pt" o:gfxdata="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" strokecolor="black [3213]" strokeweight=".5pt">
               <v:stroke joinstyle="miter"/>
               <w10:wrap anchorx="page" anchory="page"/>
             </v:line>

</xml_diff>